<commit_message>
Polish Daniil coil lab: circuit, formulas, and PC pack.
Move the switch above the coil, use 10⁻⁴ in the Word formulas, keep τз on Sheet1, and refresh the PC zip and download links.

Co-authored-by: itkodovaya <itkodovaya@users.noreply.github.com>
</commit_message>
<xml_diff>
--- a/Daniil/документы_для_ПК/1_что_сделано.docx
+++ b/Daniil/документы_для_ПК/1_что_сделано.docx
@@ -40,7 +40,7 @@
           <w:b w:val="0"/>
           <w:sz w:val="28"/>
         </w:rPr>
-        <w:t>Папка Daniil. Студент: Молчанов Даниил Александрович, группа 3012.</w:t>
+        <w:t>Папка Daniil. Студент: Молчанов Даниил Александрович, группа 3012. Преподаватель: доц. Решетников Г. П. Дата: Дубна, 2026 г.</w:t>
       </w:r>
     </w:p>
     <w:p>
@@ -53,7 +53,7 @@
           <w:b w:val="0"/>
           <w:sz w:val="28"/>
         </w:rPr>
-        <w:t>Это не конденсатор. Пересчитана работа по катушке индуктивности, как в файлах Спориша/Богатырева. В таблице с фото числа 15 в L и r заменены на 9. R = 120 Ом не трогал.</w:t>
+        <w:t>Это не конденсатор. Работа пересчитана по катушке индуктивности. В исходной таблице 15 в L и r заменены на 9. R = 120 Ом не менялся.</w:t>
       </w:r>
     </w:p>
     <w:p>
@@ -66,7 +66,7 @@
           <w:b/>
           <w:sz w:val="28"/>
         </w:rPr>
-        <w:t>Исходные данные:</w:t>
+        <w:t>Исходные данные: t0 = 0 с, I(0) = 0 А, L = 9·10⁻⁴ Гн (=POWER(10,-4)*9), E = 8 В, R = 120 Ом, r = 9 Ом.</w:t>
       </w:r>
     </w:p>
     <w:p>
@@ -79,7 +79,7 @@
           <w:b w:val="0"/>
           <w:sz w:val="28"/>
         </w:rPr>
-        <w:t>t0 = 0 с,  I(0) = 0 А,  L = 9·10⁻⁴ Гн,  E = 8 В,  R = 120 Ом,  r = 9 Ом.</w:t>
+        <w:t>Варианты: L/3 = 3·10⁻⁴ Гн; r/2 = 4,5 Ом; R/10 = 12 Ом.</w:t>
       </w:r>
     </w:p>
     <w:p>
@@ -105,7 +105,7 @@
           <w:b w:val="0"/>
           <w:sz w:val="28"/>
         </w:rPr>
-        <w:t>Daniil/задание 1.docx — отчёт (титул, схема, расчёт, графики, вывод).</w:t>
+        <w:t>Daniil/задание 1.docx — отчёт (титул 2026, схема катушки, расчёт по этапам жирным, рис. 1–7, вывод).</w:t>
       </w:r>
     </w:p>
     <w:p>
@@ -118,7 +118,7 @@
           <w:b w:val="0"/>
           <w:sz w:val="28"/>
         </w:rPr>
-        <w:t>Daniil/задание 1.xlsx — расчёт. Семь графиков Excel, не картинки. Серый фон пустых ячеек, цветная шапка.</w:t>
+        <w:t>Daniil/задание 1.xlsx — расчёт. Семь живых диаграмм Excel на листе «Графики». На Sheet1 формулы заряда и разряда.</w:t>
       </w:r>
     </w:p>
     <w:p>
@@ -131,7 +131,7 @@
           <w:b/>
           <w:sz w:val="28"/>
         </w:rPr>
-        <w:t>Что внутри Excel:</w:t>
+        <w:t>Формулы: Iз=(E/r)*(1-EXP(-t*r/L)), Uз=E*EXP(-t*r/L); Iр=(E/R)*EXP(-t*R/L), Uр=-E*EXP(-t*R/L). Разряд на графике — шаг 10τр.</w:t>
       </w:r>
     </w:p>
     <w:p>
@@ -144,7 +144,7 @@
           <w:b w:val="0"/>
           <w:sz w:val="28"/>
         </w:rPr>
-        <w:t>Три блока: базовый, L/3, r/2 и R/10. Формулы заряда Iз=(E/r)*(1-EXP(-t*r/L)), Uз=E*EXP(-t*r/L). Разряд Iр=(E/R)*EXP(-t*R/L), Uр=-E*EXP(-t*R/L). Разряд на графике считается с мелким шагом (10τр), иначе кривая сразу в нуле.</w:t>
+        <w:t>Папка Andrew не менялась (конденсатор, вариант 4).</w:t>
       </w:r>
     </w:p>
     <w:p>
@@ -157,7 +157,7 @@
           <w:b w:val="0"/>
           <w:sz w:val="28"/>
         </w:rPr>
-        <w:t>Папка Andrew не менялась (там конденсатор, вариант 4).</w:t>
+        <w:t>Готовые файлы — в репозитории на ветке cursor/fix-charts-title-2026-0310, PR https://github.com/itkodovaya/UNI/pull/3. Ссылки — во втором файле этой папки.</w:t>
       </w:r>
     </w:p>
     <w:p>
@@ -170,7 +170,7 @@
           <w:b w:val="0"/>
           <w:sz w:val="28"/>
         </w:rPr>
-        <w:t>Готовые файлы лежат в репозитории на ветке Task-1. Ссылки — во втором файле этой папки.</w:t>
+        <w:t/>
       </w:r>
     </w:p>
     <w:sectPr>

</xml_diff>

<commit_message>
Use Word equations and the handbook coil circuit.
Redraw the switch-coil figure after the lab schematic, write solution formulas as bold OMML in Word (not pictures), and keep native Excel scatter charts.

Co-authored-by: itkodovaya <itkodovaya@users.noreply.github.com>
</commit_message>
<xml_diff>
--- a/Daniil/документы_для_ПК/1_что_сделано.docx
+++ b/Daniil/документы_для_ПК/1_что_сделано.docx
@@ -27,7 +27,7 @@
           <w:b w:val="0"/>
           <w:sz w:val="28"/>
         </w:rPr>
-        <w:t>Задание 1. Заряд и разряд катушки</w:t>
+        <w:t>Задание 1. Заряд и разряд катушки. Файлы Microsoft Word (.docx) и Microsoft Excel (.xlsx).</w:t>
       </w:r>
     </w:p>
     <w:p>
@@ -40,7 +40,7 @@
           <w:b w:val="0"/>
           <w:sz w:val="28"/>
         </w:rPr>
-        <w:t>Папка Daniil. Студент: Молчанов Даниил Александрович, группа 3012. Преподаватель: доц. Решетников Г. П. Дата: Дубна, 2026 г.</w:t>
+        <w:t>Студент: Молчанов Даниил Александрович, группа 3012. Дубна, 2026 г.</w:t>
       </w:r>
     </w:p>
     <w:p>
@@ -53,7 +53,7 @@
           <w:b w:val="0"/>
           <w:sz w:val="28"/>
         </w:rPr>
-        <w:t>Это не конденсатор. Работа пересчитана по катушке индуктивности. В исходной таблице 15 в L и r заменены на 9. R = 120 Ом не менялся.</w:t>
+        <w:t>Схема как в методичке: E, лампа Л1 (r), ключ, катушка L, Л2, резистор R. Ключ влево — заряд, вправо — разряд. Это не конденсатор.</w:t>
       </w:r>
     </w:p>
     <w:p>
@@ -66,7 +66,7 @@
           <w:b/>
           <w:sz w:val="28"/>
         </w:rPr>
-        <w:t>Исходные данные: t0 = 0 с, I(0) = 0 А, L = 9·10⁻⁴ Гн (=POWER(10,-4)*9), E = 8 В, R = 120 Ом, r = 9 Ом.</w:t>
+        <w:t>Формулы в Word — уравнения Word (OMML), все жирным, не картинки. Можно щёлкнуть формулу в Word.</w:t>
       </w:r>
     </w:p>
     <w:p>
@@ -79,7 +79,7 @@
           <w:b w:val="0"/>
           <w:sz w:val="28"/>
         </w:rPr>
-        <w:t>Варианты: L/3 = 3·10⁻⁴ Гн; r/2 = 4,5 Ом; R/10 = 12 Ом.</w:t>
+        <w:t>Excel: семь точечных диаграмм на листе «Графики». B6 =POWER(10,-4)*9. Iз=(E/r)*(1-EXP(-t*r/L)), Uз=E*EXP(-t*r/L); Iр=(E/R)*EXP(-t*R/L), Uр=-E*EXP(-t*R/L).</w:t>
       </w:r>
     </w:p>
     <w:p>
@@ -92,7 +92,7 @@
           <w:b/>
           <w:sz w:val="28"/>
         </w:rPr>
-        <w:t>Файлы работы:</w:t>
+        <w:t>Папка Andrew не менялась.</w:t>
       </w:r>
     </w:p>
     <w:p>
@@ -105,7 +105,7 @@
           <w:b w:val="0"/>
           <w:sz w:val="28"/>
         </w:rPr>
-        <w:t>Daniil/задание 1.docx — отчёт (титул 2026, схема катушки, расчёт по этапам жирным, рис. 1–7, вывод).</w:t>
+        <w:t>PR: https://github.com/itkodovaya/UNI/pull/3</w:t>
       </w:r>
     </w:p>
     <w:p>
@@ -118,7 +118,7 @@
           <w:b w:val="0"/>
           <w:sz w:val="28"/>
         </w:rPr>
-        <w:t>Daniil/задание 1.xlsx — расчёт. Семь живых диаграмм Excel на листе «Графики». На Sheet1 формулы заряда и разряда.</w:t>
+        <w:t/>
       </w:r>
     </w:p>
     <w:p>
@@ -131,7 +131,7 @@
           <w:b/>
           <w:sz w:val="28"/>
         </w:rPr>
-        <w:t>Формулы: Iз=(E/r)*(1-EXP(-t*r/L)), Uз=E*EXP(-t*r/L); Iр=(E/R)*EXP(-t*R/L), Uр=-E*EXP(-t*R/L). Разряд на графике — шаг 10τр.</w:t>
+        <w:t/>
       </w:r>
     </w:p>
     <w:p>
@@ -144,7 +144,7 @@
           <w:b w:val="0"/>
           <w:sz w:val="28"/>
         </w:rPr>
-        <w:t>Папка Andrew не менялась (конденсатор, вариант 4).</w:t>
+        <w:t/>
       </w:r>
     </w:p>
     <w:p>
@@ -157,7 +157,7 @@
           <w:b w:val="0"/>
           <w:sz w:val="28"/>
         </w:rPr>
-        <w:t>Готовые файлы — в репозитории на ветке cursor/fix-charts-title-2026-0310, PR https://github.com/itkodovaya/UNI/pull/3. Ссылки — во втором файле этой папки.</w:t>
+        <w:t/>
       </w:r>
     </w:p>
     <w:p>

</xml_diff>